<commit_message>
chore: ship the updated sample in every example app
Co-Authored-By: Claude Opus 5.5 <noreply@anthropic.com>
</commit_message>
<xml_diff>
--- a/examples/astro/public/sample.docx
+++ b/examples/astro/public/sample.docx
@@ -1900,18 +1900,9 @@
       </w:r>
       <w:r>
         <w:rPr>
-          <w:rFonts w:ascii="Georgia" w:cs="Georgia" w:eastAsia="Georgia" w:hAnsi="Georgia"/>
+          <w:rFonts w:ascii="Calibri" w:cs="Calibri" w:eastAsia="Calibri" w:hAnsi="Calibri"/>
         </w:rPr>
-        <w:t xml:space="preserve">Georgia</w:t>
-      </w:r>
-      <w:r>
-        <w:t xml:space="preserve"> | </w:t>
-      </w:r>
-      <w:r>
-        <w:rPr>
-          <w:rFonts w:ascii="Verdana" w:cs="Verdana" w:eastAsia="Verdana" w:hAnsi="Verdana"/>
-        </w:rPr>
-        <w:t xml:space="preserve">Verdana</w:t>
+        <w:t xml:space="preserve">Calibri</w:t>
       </w:r>
     </w:p>
     <w:p>
@@ -17176,7 +17167,7 @@
                 <a:solidFill>
                   <a:srgbClr val="25364A"/>
                 </a:solidFill>
-                <a:latin typeface="Aptos"/>
+                <a:latin typeface="Calibri"/>
               </a:defRPr>
             </a:pPr>
             <a:r>
@@ -17184,7 +17175,7 @@
                 <a:solidFill>
                   <a:srgbClr val="25364A"/>
                 </a:solidFill>
-                <a:latin typeface="Aptos"/>
+                <a:latin typeface="Calibri"/>
               </a:rPr>
               <a:t>Delivery and capacity</a:t>
             </a:r>
@@ -17530,7 +17521,7 @@
         <a:p>
           <a:pPr>
             <a:defRPr sz="1000" baseline="0">
-              <a:latin typeface="Aptos"/>
+              <a:latin typeface="Calibri"/>
             </a:defRPr>
           </a:pPr>
           <a:endParaRPr lang="en-US"/>
@@ -17573,7 +17564,7 @@
                 <a:solidFill>
                   <a:srgbClr val="25364A"/>
                 </a:solidFill>
-                <a:latin typeface="Aptos"/>
+                <a:latin typeface="Calibri"/>
               </a:defRPr>
             </a:pPr>
             <a:r>
@@ -17581,7 +17572,7 @@
                 <a:solidFill>
                   <a:srgbClr val="25364A"/>
                 </a:solidFill>
-                <a:latin typeface="Aptos"/>
+                <a:latin typeface="Calibri"/>
               </a:rPr>
               <a:t>Where effort goes</a:t>
             </a:r>
@@ -17724,7 +17715,7 @@
         <a:p>
           <a:pPr rtl="0">
             <a:defRPr sz="1000" baseline="0">
-              <a:latin typeface="Aptos"/>
+              <a:latin typeface="Calibri"/>
             </a:defRPr>
           </a:pPr>
           <a:endParaRPr lang="en-US"/>

</xml_diff>